<commit_message>
Atualiza pacote de revisão com os cenários 4, 6 e 7 e fecha o estado do projeto
Pacote de revisão: 20 itens de risco (R-15 a R-20 novos: isolar setor de
incêndio para estancar alagamento, gases de esgoto, restringir uso de
água a montante, desenergizar sem habilitado, higienização e descarte,
rede de incêndio), 20 valores a fixar (V-16 a V-20) e 14 decisões de
política (Q-11 a Q-14). Registra que os cenários 4, 6 e 7 ainda não
foram conferidos contra os demais e que só falta o cenário T.

LEIAME, texto da planilha-mestre, spec e MEMORY atualizados.

Co-Authored-By: Claude Sonnet 5.5 <noreply@anthropic.com>
Claude-Session: https://claude.ai/code/session_015N8NW4o2BbADwSCH4ZsDyY
</commit_message>
<xml_diff>
--- a/entregas/plano-contingencia-agua/revisao-tecnica/pacote-de-revisao-tecnica.docx
+++ b/entregas/plano-contingencia-agua/revisao-tecnica/pacote-de-revisao-tecnica.docx
@@ -90,7 +90,20 @@
         <w:t xml:space="preserve"> </w:t>
       </w:r>
       <w:r>
-        <w:t xml:space="preserve">catálogo v2, cenários 1, 2, 3, 5, 8 e 9, checklists e planilha-mestre, todos em</w:t>
+        <w:t xml:space="preserve">catálogo v2, cenários 1 a 9 (falta só o</w:t>
+      </w:r>
+      <w:r>
+        <w:t xml:space="preserve"> </w:t>
+      </w:r>
+      <w:r>
+        <w:rPr>
+          <w:b/>
+          <w:bCs/>
+        </w:rPr>
+        <w:t xml:space="preserve">T</w:t>
+      </w:r>
+      <w:r>
+        <w:t xml:space="preserve">, comunicação de crise), checklists e planilha-mestre, todos em</w:t>
       </w:r>
       <w:r>
         <w:t xml:space="preserve"> </w:t>
@@ -335,7 +348,7 @@
         <w:t xml:space="preserve"> </w:t>
       </w:r>
       <w:r>
-        <w:t xml:space="preserve">dos seis cenários (1 página cada); (3) o</w:t>
+        <w:t xml:space="preserve">dos oito cenários (1 página cada); (3) o</w:t>
       </w:r>
       <w:r>
         <w:t xml:space="preserve"> </w:t>
@@ -604,6 +617,22 @@
                 <w:b/>
                 <w:bCs/>
               </w:rPr>
+              <w:t xml:space="preserve">4</w:t>
+            </w:r>
+            <w:r>
+              <w:t xml:space="preserve"> </w:t>
+            </w:r>
+            <w:r>
+              <w:t xml:space="preserve">vazamento e alagamento ·</w:t>
+            </w:r>
+            <w:r>
+              <w:t xml:space="preserve"> </w:t>
+            </w:r>
+            <w:r>
+              <w:rPr>
+                <w:b/>
+                <w:bCs/>
+              </w:rPr>
               <w:t xml:space="preserve">5</w:t>
             </w:r>
             <w:r>
@@ -611,6 +640,38 @@
             </w:r>
             <w:r>
               <w:t xml:space="preserve">falha de bomba ou energia ·</w:t>
+            </w:r>
+            <w:r>
+              <w:t xml:space="preserve"> </w:t>
+            </w:r>
+            <w:r>
+              <w:rPr>
+                <w:b/>
+                <w:bCs/>
+              </w:rPr>
+              <w:t xml:space="preserve">6</w:t>
+            </w:r>
+            <w:r>
+              <w:t xml:space="preserve"> </w:t>
+            </w:r>
+            <w:r>
+              <w:t xml:space="preserve">incêndio com reserva indisponível ·</w:t>
+            </w:r>
+            <w:r>
+              <w:t xml:space="preserve"> </w:t>
+            </w:r>
+            <w:r>
+              <w:rPr>
+                <w:b/>
+                <w:bCs/>
+              </w:rPr>
+              <w:t xml:space="preserve">7</w:t>
+            </w:r>
+            <w:r>
+              <w:t xml:space="preserve"> </w:t>
+            </w:r>
+            <w:r>
+              <w:t xml:space="preserve">refluxo de esgoto ·</w:t>
             </w:r>
             <w:r>
               <w:t xml:space="preserve"> </w:t>
@@ -2518,6 +2579,600 @@
           </w:p>
         </w:tc>
       </w:tr>
+      <w:tr>
+        <w:tc>
+          <w:tcPr/>
+          <w:p>
+            <w:pPr>
+              <w:pStyle w:val="Compact"/>
+            </w:pPr>
+            <w:r>
+              <w:rPr>
+                <w:b/>
+                <w:bCs/>
+              </w:rPr>
+              <w:t xml:space="preserve">R-15</w:t>
+            </w:r>
+          </w:p>
+        </w:tc>
+        <w:tc>
+          <w:tcPr/>
+          <w:p>
+            <w:pPr>
+              <w:pStyle w:val="Compact"/>
+            </w:pPr>
+            <w:r>
+              <w:rPr>
+                <w:b/>
+                <w:bCs/>
+              </w:rPr>
+              <w:t xml:space="preserve">Isolar setor de incêndio para estancar alagamento</w:t>
+            </w:r>
+            <w:r>
+              <w:t xml:space="preserve"> </w:t>
+            </w:r>
+            <w:r>
+              <w:t xml:space="preserve">(sprinkler disparado, rede rompida): fechar a válvula do setor</w:t>
+            </w:r>
+            <w:r>
+              <w:t xml:space="preserve"> </w:t>
+            </w:r>
+            <w:r>
+              <w:rPr>
+                <w:b/>
+                <w:bCs/>
+              </w:rPr>
+              <w:t xml:space="preserve">tensiona</w:t>
+            </w:r>
+            <w:r>
+              <w:t xml:space="preserve"> </w:t>
+            </w:r>
+            <w:r>
+              <w:t xml:space="preserve">o princípio de nunca fechar proteção sem o síndico. Vale</w:t>
+            </w:r>
+            <w:r>
+              <w:t xml:space="preserve"> </w:t>
+            </w:r>
+            <w:r>
+              <w:rPr>
+                <w:b/>
+                <w:bCs/>
+              </w:rPr>
+              <w:t xml:space="preserve">pré-autorização do nível 1 na ficha</w:t>
+            </w:r>
+            <w:r>
+              <w:t xml:space="preserve"> </w:t>
+            </w:r>
+            <w:r>
+              <w:t xml:space="preserve">ou só decisão do síndico? Quem decide se o síndico não é localizado? Tempo máximo sem proteção? Recolocação por tipo de rede (seca, pré-ação)</w:t>
+            </w:r>
+          </w:p>
+        </w:tc>
+        <w:tc>
+          <w:tcPr/>
+          <w:p>
+            <w:pPr>
+              <w:pStyle w:val="Compact"/>
+            </w:pPr>
+            <w:r>
+              <w:t xml:space="preserve">Cen. 4 ramo F; Cen. 6 ramo D</w:t>
+            </w:r>
+          </w:p>
+        </w:tc>
+        <w:tc>
+          <w:tcPr/>
+          <w:p>
+            <w:pPr>
+              <w:pStyle w:val="Compact"/>
+            </w:pPr>
+            <w:r>
+              <w:t xml:space="preserve">Síndico + RT incêndio</w:t>
+            </w:r>
+          </w:p>
+        </w:tc>
+        <w:tc>
+          <w:tcPr/>
+          <w:p>
+            <w:pPr>
+              <w:pStyle w:val="Compact"/>
+            </w:pPr>
+          </w:p>
+        </w:tc>
+        <w:tc>
+          <w:tcPr/>
+          <w:p>
+            <w:pPr>
+              <w:pStyle w:val="Compact"/>
+            </w:pPr>
+          </w:p>
+        </w:tc>
+      </w:tr>
+      <w:tr>
+        <w:tc>
+          <w:tcPr/>
+          <w:p>
+            <w:pPr>
+              <w:pStyle w:val="Compact"/>
+            </w:pPr>
+            <w:r>
+              <w:rPr>
+                <w:b/>
+                <w:bCs/>
+              </w:rPr>
+              <w:t xml:space="preserve">R-16</w:t>
+            </w:r>
+          </w:p>
+        </w:tc>
+        <w:tc>
+          <w:tcPr/>
+          <w:p>
+            <w:pPr>
+              <w:pStyle w:val="Compact"/>
+            </w:pPr>
+            <w:r>
+              <w:rPr>
+                <w:b/>
+                <w:bCs/>
+              </w:rPr>
+              <w:t xml:space="preserve">Gases de esgoto e atmosfera em poço, caixa e subsolo:</w:t>
+            </w:r>
+            <w:r>
+              <w:t xml:space="preserve"> </w:t>
+            </w:r>
+            <w:r>
+              <w:t xml:space="preserve">a ronda tem detector? quem usa, como? EPI e proteção respiratória; conduta em contato com mucosa ou ferida. (A nota de que o gás pode ser tóxico e inflamável e que o cheiro deixa de ser percebido está</w:t>
+            </w:r>
+            <w:r>
+              <w:t xml:space="preserve"> </w:t>
+            </w:r>
+            <w:r>
+              <w:rPr>
+                <w:b/>
+                <w:bCs/>
+              </w:rPr>
+              <w:t xml:space="preserve">sem fonte</w:t>
+            </w:r>
+            <w:r>
+              <w:t xml:space="preserve"> </w:t>
+            </w:r>
+            <w:r>
+              <w:t xml:space="preserve">e precisa de confirmação)</w:t>
+            </w:r>
+          </w:p>
+        </w:tc>
+        <w:tc>
+          <w:tcPr/>
+          <w:p>
+            <w:pPr>
+              <w:pStyle w:val="Compact"/>
+            </w:pPr>
+            <w:r>
+              <w:t xml:space="preserve">Cen. 7 seção 3</w:t>
+            </w:r>
+          </w:p>
+        </w:tc>
+        <w:tc>
+          <w:tcPr/>
+          <w:p>
+            <w:pPr>
+              <w:pStyle w:val="Compact"/>
+            </w:pPr>
+            <w:r>
+              <w:t xml:space="preserve">RT / segurança do trabalho</w:t>
+            </w:r>
+          </w:p>
+        </w:tc>
+        <w:tc>
+          <w:tcPr/>
+          <w:p>
+            <w:pPr>
+              <w:pStyle w:val="Compact"/>
+            </w:pPr>
+          </w:p>
+        </w:tc>
+        <w:tc>
+          <w:tcPr/>
+          <w:p>
+            <w:pPr>
+              <w:pStyle w:val="Compact"/>
+            </w:pPr>
+          </w:p>
+        </w:tc>
+      </w:tr>
+      <w:tr>
+        <w:tc>
+          <w:tcPr/>
+          <w:p>
+            <w:pPr>
+              <w:pStyle w:val="Compact"/>
+            </w:pPr>
+            <w:r>
+              <w:rPr>
+                <w:b/>
+                <w:bCs/>
+              </w:rPr>
+              <w:t xml:space="preserve">R-17</w:t>
+            </w:r>
+          </w:p>
+        </w:tc>
+        <w:tc>
+          <w:tcPr/>
+          <w:p>
+            <w:pPr>
+              <w:pStyle w:val="Compact"/>
+            </w:pPr>
+            <w:r>
+              <w:rPr>
+                <w:b/>
+                <w:bCs/>
+              </w:rPr>
+              <w:t xml:space="preserve">Restringir uso de água e descarga a montante</w:t>
+            </w:r>
+            <w:r>
+              <w:t xml:space="preserve"> </w:t>
+            </w:r>
+            <w:r>
+              <w:t xml:space="preserve">quando a coluna está entupida, e</w:t>
+            </w:r>
+            <w:r>
+              <w:t xml:space="preserve"> </w:t>
+            </w:r>
+            <w:r>
+              <w:rPr>
+                <w:b/>
+                <w:bCs/>
+              </w:rPr>
+              <w:t xml:space="preserve">quando cortar o abastecimento do trecho</w:t>
+            </w:r>
+            <w:r>
+              <w:t xml:space="preserve"> </w:t>
+            </w:r>
+            <w:r>
+              <w:t xml:space="preserve">em vez de só avisar (critério de "pavimentos a montante"); tamponar ralos do subsolo</w:t>
+            </w:r>
+          </w:p>
+        </w:tc>
+        <w:tc>
+          <w:tcPr/>
+          <w:p>
+            <w:pPr>
+              <w:pStyle w:val="Compact"/>
+            </w:pPr>
+            <w:r>
+              <w:t xml:space="preserve">Cen. 7 fase 1 e ramo B</w:t>
+            </w:r>
+          </w:p>
+        </w:tc>
+        <w:tc>
+          <w:tcPr/>
+          <w:p>
+            <w:pPr>
+              <w:pStyle w:val="Compact"/>
+            </w:pPr>
+            <w:r>
+              <w:t xml:space="preserve">RT + nível 1</w:t>
+            </w:r>
+          </w:p>
+        </w:tc>
+        <w:tc>
+          <w:tcPr/>
+          <w:p>
+            <w:pPr>
+              <w:pStyle w:val="Compact"/>
+            </w:pPr>
+          </w:p>
+        </w:tc>
+        <w:tc>
+          <w:tcPr/>
+          <w:p>
+            <w:pPr>
+              <w:pStyle w:val="Compact"/>
+            </w:pPr>
+          </w:p>
+        </w:tc>
+      </w:tr>
+      <w:tr>
+        <w:tc>
+          <w:tcPr/>
+          <w:p>
+            <w:pPr>
+              <w:pStyle w:val="Compact"/>
+            </w:pPr>
+            <w:r>
+              <w:rPr>
+                <w:b/>
+                <w:bCs/>
+              </w:rPr>
+              <w:t xml:space="preserve">R-18</w:t>
+            </w:r>
+          </w:p>
+        </w:tc>
+        <w:tc>
+          <w:tcPr/>
+          <w:p>
+            <w:pPr>
+              <w:pStyle w:val="Compact"/>
+            </w:pPr>
+            <w:r>
+              <w:rPr>
+                <w:b/>
+                <w:bCs/>
+              </w:rPr>
+              <w:t xml:space="preserve">Desenergizar sem habilitado disponível</w:t>
+            </w:r>
+            <w:r>
+              <w:t xml:space="preserve"> </w:t>
+            </w:r>
+            <w:r>
+              <w:t xml:space="preserve">(isolar a área e esperar o fornecedor?) e</w:t>
+            </w:r>
+            <w:r>
+              <w:t xml:space="preserve"> </w:t>
+            </w:r>
+            <w:r>
+              <w:rPr>
+                <w:b/>
+                <w:bCs/>
+              </w:rPr>
+              <w:t xml:space="preserve">verificar e religar quadro ou motor molhado</w:t>
+            </w:r>
+            <w:r>
+              <w:t xml:space="preserve">: testes, quando recuperar, quando trocar. Lista de quadros no caminho da água por prédio</w:t>
+            </w:r>
+          </w:p>
+        </w:tc>
+        <w:tc>
+          <w:tcPr/>
+          <w:p>
+            <w:pPr>
+              <w:pStyle w:val="Compact"/>
+            </w:pPr>
+            <w:r>
+              <w:t xml:space="preserve">Cen. 4 seções 3 e 12</w:t>
+            </w:r>
+          </w:p>
+        </w:tc>
+        <w:tc>
+          <w:tcPr/>
+          <w:p>
+            <w:pPr>
+              <w:pStyle w:val="Compact"/>
+            </w:pPr>
+            <w:r>
+              <w:t xml:space="preserve">RT elétrico</w:t>
+            </w:r>
+          </w:p>
+        </w:tc>
+        <w:tc>
+          <w:tcPr/>
+          <w:p>
+            <w:pPr>
+              <w:pStyle w:val="Compact"/>
+            </w:pPr>
+          </w:p>
+        </w:tc>
+        <w:tc>
+          <w:tcPr/>
+          <w:p>
+            <w:pPr>
+              <w:pStyle w:val="Compact"/>
+            </w:pPr>
+          </w:p>
+        </w:tc>
+      </w:tr>
+      <w:tr>
+        <w:tc>
+          <w:tcPr/>
+          <w:p>
+            <w:pPr>
+              <w:pStyle w:val="Compact"/>
+            </w:pPr>
+            <w:r>
+              <w:rPr>
+                <w:b/>
+                <w:bCs/>
+              </w:rPr>
+              <w:t xml:space="preserve">R-19</w:t>
+            </w:r>
+          </w:p>
+        </w:tc>
+        <w:tc>
+          <w:tcPr/>
+          <w:p>
+            <w:pPr>
+              <w:pStyle w:val="Compact"/>
+            </w:pPr>
+            <w:r>
+              <w:rPr>
+                <w:b/>
+                <w:bCs/>
+              </w:rPr>
+              <w:t xml:space="preserve">Higienização de área atingida por esgoto ou água contaminada</w:t>
+            </w:r>
+            <w:r>
+              <w:t xml:space="preserve"> </w:t>
+            </w:r>
+            <w:r>
+              <w:t xml:space="preserve">(produto, diluição, tempo de contato) e</w:t>
+            </w:r>
+            <w:r>
+              <w:t xml:space="preserve"> </w:t>
+            </w:r>
+            <w:r>
+              <w:rPr>
+                <w:b/>
+                <w:bCs/>
+              </w:rPr>
+              <w:t xml:space="preserve">descarte de materiais porosos e resíduo contaminado</w:t>
+            </w:r>
+            <w:r>
+              <w:t xml:space="preserve"> </w:t>
+            </w:r>
+            <w:r>
+              <w:t xml:space="preserve">(enquadramento, embalagem, comprovante)</w:t>
+            </w:r>
+          </w:p>
+        </w:tc>
+        <w:tc>
+          <w:tcPr/>
+          <w:p>
+            <w:pPr>
+              <w:pStyle w:val="Compact"/>
+            </w:pPr>
+            <w:r>
+              <w:t xml:space="preserve">Cen. 4; Cen. 7 seção 9</w:t>
+            </w:r>
+          </w:p>
+        </w:tc>
+        <w:tc>
+          <w:tcPr/>
+          <w:p>
+            <w:pPr>
+              <w:pStyle w:val="Compact"/>
+            </w:pPr>
+            <w:r>
+              <w:t xml:space="preserve">RT</w:t>
+            </w:r>
+          </w:p>
+        </w:tc>
+        <w:tc>
+          <w:tcPr/>
+          <w:p>
+            <w:pPr>
+              <w:pStyle w:val="Compact"/>
+            </w:pPr>
+          </w:p>
+        </w:tc>
+        <w:tc>
+          <w:tcPr/>
+          <w:p>
+            <w:pPr>
+              <w:pStyle w:val="Compact"/>
+            </w:pPr>
+          </w:p>
+        </w:tc>
+      </w:tr>
+      <w:tr>
+        <w:tc>
+          <w:tcPr/>
+          <w:p>
+            <w:pPr>
+              <w:pStyle w:val="Compact"/>
+            </w:pPr>
+            <w:r>
+              <w:rPr>
+                <w:b/>
+                <w:bCs/>
+              </w:rPr>
+              <w:t xml:space="preserve">R-20</w:t>
+            </w:r>
+          </w:p>
+        </w:tc>
+        <w:tc>
+          <w:tcPr/>
+          <w:p>
+            <w:pPr>
+              <w:pStyle w:val="Compact"/>
+            </w:pPr>
+            <w:r>
+              <w:rPr>
+                <w:b/>
+                <w:bCs/>
+              </w:rPr>
+              <w:t xml:space="preserve">Rede de incêndio:</w:t>
+            </w:r>
+            <w:r>
+              <w:t xml:space="preserve"> </w:t>
+            </w:r>
+            <w:r>
+              <w:t xml:space="preserve">reabrir válvula fechada (ficha, registro, segunda pessoa),</w:t>
+            </w:r>
+            <w:r>
+              <w:t xml:space="preserve"> </w:t>
+            </w:r>
+            <w:r>
+              <w:rPr>
+                <w:b/>
+                <w:bCs/>
+              </w:rPr>
+              <w:t xml:space="preserve">encher a rede</w:t>
+            </w:r>
+            <w:r>
+              <w:t xml:space="preserve"> </w:t>
+            </w:r>
+            <w:r>
+              <w:t xml:space="preserve">(golpe de aríete, purga, rede seca e pré-ação),</w:t>
+            </w:r>
+            <w:r>
+              <w:t xml:space="preserve"> </w:t>
+            </w:r>
+            <w:r>
+              <w:rPr>
+                <w:b/>
+                <w:bCs/>
+              </w:rPr>
+              <w:t xml:space="preserve">troca de sprinkler</w:t>
+            </w:r>
+            <w:r>
+              <w:t xml:space="preserve">, o que a ronda pode</w:t>
+            </w:r>
+            <w:r>
+              <w:t xml:space="preserve"> </w:t>
+            </w:r>
+            <w:r>
+              <w:rPr>
+                <w:b/>
+                <w:bCs/>
+              </w:rPr>
+              <w:t xml:space="preserve">silenciar, habilitar e reabilitar</w:t>
+            </w:r>
+            <w:r>
+              <w:t xml:space="preserve"> </w:t>
+            </w:r>
+            <w:r>
+              <w:t xml:space="preserve">na central de alarme</w:t>
+            </w:r>
+          </w:p>
+        </w:tc>
+        <w:tc>
+          <w:tcPr/>
+          <w:p>
+            <w:pPr>
+              <w:pStyle w:val="Compact"/>
+            </w:pPr>
+            <w:r>
+              <w:t xml:space="preserve">Cen. 6 seções 5, 6 e 11</w:t>
+            </w:r>
+          </w:p>
+        </w:tc>
+        <w:tc>
+          <w:tcPr/>
+          <w:p>
+            <w:pPr>
+              <w:pStyle w:val="Compact"/>
+            </w:pPr>
+            <w:r>
+              <w:t xml:space="preserve">RT incêndio / fornecedor</w:t>
+            </w:r>
+          </w:p>
+        </w:tc>
+        <w:tc>
+          <w:tcPr/>
+          <w:p>
+            <w:pPr>
+              <w:pStyle w:val="Compact"/>
+            </w:pPr>
+          </w:p>
+        </w:tc>
+        <w:tc>
+          <w:tcPr/>
+          <w:p>
+            <w:pPr>
+              <w:pStyle w:val="Compact"/>
+            </w:pPr>
+          </w:p>
+        </w:tc>
+      </w:tr>
     </w:tbl>
     <w:bookmarkEnd w:id="11"/>
     <w:bookmarkStart w:id="12" w:name="X87b87d63a7f3aac9bf96773e8fed7a845ef2925"/>
@@ -3898,6 +4553,423 @@
           </w:p>
         </w:tc>
       </w:tr>
+      <w:tr>
+        <w:tc>
+          <w:tcPr/>
+          <w:p>
+            <w:pPr>
+              <w:pStyle w:val="Compact"/>
+            </w:pPr>
+            <w:r>
+              <w:rPr>
+                <w:b/>
+                <w:bCs/>
+              </w:rPr>
+              <w:t xml:space="preserve">V-16</w:t>
+            </w:r>
+          </w:p>
+        </w:tc>
+        <w:tc>
+          <w:tcPr/>
+          <w:p>
+            <w:pPr>
+              <w:pStyle w:val="Compact"/>
+            </w:pPr>
+            <w:r>
+              <w:rPr>
+                <w:b/>
+                <w:bCs/>
+              </w:rPr>
+              <w:t xml:space="preserve">Secagem e mofo:</w:t>
+            </w:r>
+            <w:r>
+              <w:t xml:space="preserve"> </w:t>
+            </w:r>
+            <w:r>
+              <w:t xml:space="preserve">método, equipamento, prazo para retirar material molhado e critério para dar por seco</w:t>
+            </w:r>
+          </w:p>
+        </w:tc>
+        <w:tc>
+          <w:tcPr/>
+          <w:p>
+            <w:pPr>
+              <w:pStyle w:val="Compact"/>
+            </w:pPr>
+            <w:r>
+              <w:t xml:space="preserve">Cen. 4</w:t>
+            </w:r>
+          </w:p>
+        </w:tc>
+        <w:tc>
+          <w:tcPr/>
+          <w:p>
+            <w:pPr>
+              <w:pStyle w:val="Compact"/>
+            </w:pPr>
+            <w:r>
+              <w:t xml:space="preserve">RT</w:t>
+            </w:r>
+          </w:p>
+        </w:tc>
+        <w:tc>
+          <w:tcPr/>
+          <w:p>
+            <w:pPr>
+              <w:pStyle w:val="Compact"/>
+            </w:pPr>
+          </w:p>
+        </w:tc>
+      </w:tr>
+      <w:tr>
+        <w:tc>
+          <w:tcPr/>
+          <w:p>
+            <w:pPr>
+              <w:pStyle w:val="Compact"/>
+            </w:pPr>
+            <w:r>
+              <w:rPr>
+                <w:b/>
+                <w:bCs/>
+              </w:rPr>
+              <w:t xml:space="preserve">V-17</w:t>
+            </w:r>
+          </w:p>
+        </w:tc>
+        <w:tc>
+          <w:tcPr/>
+          <w:p>
+            <w:pPr>
+              <w:pStyle w:val="Compact"/>
+            </w:pPr>
+            <w:r>
+              <w:rPr>
+                <w:b/>
+                <w:bCs/>
+              </w:rPr>
+              <w:t xml:space="preserve">Válvula de retenção e comporta</w:t>
+            </w:r>
+            <w:r>
+              <w:t xml:space="preserve"> </w:t>
+            </w:r>
+            <w:r>
+              <w:t xml:space="preserve">da rede de esgoto: instrução de manobra, teste e periodicidade;</w:t>
+            </w:r>
+            <w:r>
+              <w:t xml:space="preserve"> </w:t>
+            </w:r>
+            <w:r>
+              <w:rPr>
+                <w:b/>
+                <w:bCs/>
+              </w:rPr>
+              <w:t xml:space="preserve">limpeza de caixa de gordura e de inspeção</w:t>
+            </w:r>
+            <w:r>
+              <w:t xml:space="preserve"> </w:t>
+            </w:r>
+            <w:r>
+              <w:t xml:space="preserve">e</w:t>
+            </w:r>
+            <w:r>
+              <w:t xml:space="preserve"> </w:t>
+            </w:r>
+            <w:r>
+              <w:rPr>
+                <w:b/>
+                <w:bCs/>
+              </w:rPr>
+              <w:t xml:space="preserve">desentupimento</w:t>
+            </w:r>
+            <w:r>
+              <w:t xml:space="preserve">: método e periodicidade</w:t>
+            </w:r>
+          </w:p>
+        </w:tc>
+        <w:tc>
+          <w:tcPr/>
+          <w:p>
+            <w:pPr>
+              <w:pStyle w:val="Compact"/>
+            </w:pPr>
+            <w:r>
+              <w:t xml:space="preserve">Cen. 7</w:t>
+            </w:r>
+          </w:p>
+        </w:tc>
+        <w:tc>
+          <w:tcPr/>
+          <w:p>
+            <w:pPr>
+              <w:pStyle w:val="Compact"/>
+            </w:pPr>
+            <w:r>
+              <w:t xml:space="preserve">RT / fornecedor</w:t>
+            </w:r>
+          </w:p>
+        </w:tc>
+        <w:tc>
+          <w:tcPr/>
+          <w:p>
+            <w:pPr>
+              <w:pStyle w:val="Compact"/>
+            </w:pPr>
+          </w:p>
+        </w:tc>
+      </w:tr>
+      <w:tr>
+        <w:tc>
+          <w:tcPr/>
+          <w:p>
+            <w:pPr>
+              <w:pStyle w:val="Compact"/>
+            </w:pPr>
+            <w:r>
+              <w:rPr>
+                <w:b/>
+                <w:bCs/>
+              </w:rPr>
+              <w:t xml:space="preserve">V-18</w:t>
+            </w:r>
+          </w:p>
+        </w:tc>
+        <w:tc>
+          <w:tcPr/>
+          <w:p>
+            <w:pPr>
+              <w:pStyle w:val="Compact"/>
+            </w:pPr>
+            <w:r>
+              <w:rPr>
+                <w:b/>
+                <w:bCs/>
+              </w:rPr>
+              <w:t xml:space="preserve">RTI:</w:t>
+            </w:r>
+            <w:r>
+              <w:t xml:space="preserve"> </w:t>
+            </w:r>
+            <w:r>
+              <w:t xml:space="preserve">volume e nível mínimo; critério de</w:t>
+            </w:r>
+            <w:r>
+              <w:t xml:space="preserve"> </w:t>
+            </w:r>
+            <w:r>
+              <w:rPr>
+                <w:b/>
+                <w:bCs/>
+              </w:rPr>
+              <w:t xml:space="preserve">qualidade da água de reposição</w:t>
+            </w:r>
+            <w:r>
+              <w:t xml:space="preserve"> </w:t>
+            </w:r>
+            <w:r>
+              <w:t xml:space="preserve">(origem, tanque, cloro), estagnação e renovação; se se pode receber água pela siamesa</w:t>
+            </w:r>
+          </w:p>
+        </w:tc>
+        <w:tc>
+          <w:tcPr/>
+          <w:p>
+            <w:pPr>
+              <w:pStyle w:val="Compact"/>
+            </w:pPr>
+            <w:r>
+              <w:t xml:space="preserve">Cen. 6</w:t>
+            </w:r>
+          </w:p>
+        </w:tc>
+        <w:tc>
+          <w:tcPr/>
+          <w:p>
+            <w:pPr>
+              <w:pStyle w:val="Compact"/>
+            </w:pPr>
+            <w:r>
+              <w:t xml:space="preserve">RT incêndio</w:t>
+            </w:r>
+          </w:p>
+        </w:tc>
+        <w:tc>
+          <w:tcPr/>
+          <w:p>
+            <w:pPr>
+              <w:pStyle w:val="Compact"/>
+            </w:pPr>
+          </w:p>
+        </w:tc>
+      </w:tr>
+      <w:tr>
+        <w:tc>
+          <w:tcPr/>
+          <w:p>
+            <w:pPr>
+              <w:pStyle w:val="Compact"/>
+            </w:pPr>
+            <w:r>
+              <w:rPr>
+                <w:b/>
+                <w:bCs/>
+              </w:rPr>
+              <w:t xml:space="preserve">V-19</w:t>
+            </w:r>
+          </w:p>
+        </w:tc>
+        <w:tc>
+          <w:tcPr/>
+          <w:p>
+            <w:pPr>
+              <w:pStyle w:val="Compact"/>
+            </w:pPr>
+            <w:r>
+              <w:rPr>
+                <w:b/>
+                <w:bCs/>
+              </w:rPr>
+              <w:t xml:space="preserve">Flexíveis</w:t>
+            </w:r>
+            <w:r>
+              <w:t xml:space="preserve"> </w:t>
+            </w:r>
+            <w:r>
+              <w:t xml:space="preserve">(vida útil, critério de troca, registro de bloqueio nos equipamentos dos locatários) e</w:t>
+            </w:r>
+            <w:r>
+              <w:t xml:space="preserve"> </w:t>
+            </w:r>
+            <w:r>
+              <w:rPr>
+                <w:b/>
+                <w:bCs/>
+              </w:rPr>
+              <w:t xml:space="preserve">gatilho de ronda preventiva em chuva forte</w:t>
+            </w:r>
+            <w:r>
+              <w:t xml:space="preserve"> </w:t>
+            </w:r>
+            <w:r>
+              <w:t xml:space="preserve">(sem citar fonte de alerta)</w:t>
+            </w:r>
+          </w:p>
+        </w:tc>
+        <w:tc>
+          <w:tcPr/>
+          <w:p>
+            <w:pPr>
+              <w:pStyle w:val="Compact"/>
+            </w:pPr>
+            <w:r>
+              <w:t xml:space="preserve">Cen. 4</w:t>
+            </w:r>
+          </w:p>
+        </w:tc>
+        <w:tc>
+          <w:tcPr/>
+          <w:p>
+            <w:pPr>
+              <w:pStyle w:val="Compact"/>
+            </w:pPr>
+            <w:r>
+              <w:t xml:space="preserve">RT / manutenção</w:t>
+            </w:r>
+          </w:p>
+        </w:tc>
+        <w:tc>
+          <w:tcPr/>
+          <w:p>
+            <w:pPr>
+              <w:pStyle w:val="Compact"/>
+            </w:pPr>
+          </w:p>
+        </w:tc>
+      </w:tr>
+      <w:tr>
+        <w:tc>
+          <w:tcPr/>
+          <w:p>
+            <w:pPr>
+              <w:pStyle w:val="Compact"/>
+            </w:pPr>
+            <w:r>
+              <w:rPr>
+                <w:b/>
+                <w:bCs/>
+              </w:rPr>
+              <w:t xml:space="preserve">V-20</w:t>
+            </w:r>
+          </w:p>
+        </w:tc>
+        <w:tc>
+          <w:tcPr/>
+          <w:p>
+            <w:pPr>
+              <w:pStyle w:val="Compact"/>
+            </w:pPr>
+            <w:r>
+              <w:rPr>
+                <w:b/>
+                <w:bCs/>
+              </w:rPr>
+              <w:t xml:space="preserve">Vigilância reforçada de incêndio:</w:t>
+            </w:r>
+            <w:r>
+              <w:t xml:space="preserve"> </w:t>
+            </w:r>
+            <w:r>
+              <w:t xml:space="preserve">frequência da ronda (dupla à noite), intervalo de leitura do nível da RTI, período de vigilância reforçada após o retorno, escopo do</w:t>
+            </w:r>
+            <w:r>
+              <w:t xml:space="preserve"> </w:t>
+            </w:r>
+            <w:r>
+              <w:rPr>
+                <w:b/>
+                <w:bCs/>
+              </w:rPr>
+              <w:t xml:space="preserve">trabalho a quente</w:t>
+            </w:r>
+            <w:r>
+              <w:t xml:space="preserve"> </w:t>
+            </w:r>
+            <w:r>
+              <w:t xml:space="preserve">e quem autoriza o retorno</w:t>
+            </w:r>
+          </w:p>
+        </w:tc>
+        <w:tc>
+          <w:tcPr/>
+          <w:p>
+            <w:pPr>
+              <w:pStyle w:val="Compact"/>
+            </w:pPr>
+            <w:r>
+              <w:t xml:space="preserve">Cen. 6</w:t>
+            </w:r>
+          </w:p>
+        </w:tc>
+        <w:tc>
+          <w:tcPr/>
+          <w:p>
+            <w:pPr>
+              <w:pStyle w:val="Compact"/>
+            </w:pPr>
+            <w:r>
+              <w:t xml:space="preserve">Síndico + RT incêndio</w:t>
+            </w:r>
+          </w:p>
+        </w:tc>
+        <w:tc>
+          <w:tcPr/>
+          <w:p>
+            <w:pPr>
+              <w:pStyle w:val="Compact"/>
+            </w:pPr>
+          </w:p>
+        </w:tc>
+      </w:tr>
     </w:tbl>
     <w:bookmarkEnd w:id="12"/>
     <w:bookmarkStart w:id="13" w:name="X60a55bf0663fec5e164469a23abceb979606908"/>
@@ -4579,6 +5651,282 @@
           </w:p>
         </w:tc>
       </w:tr>
+      <w:tr>
+        <w:tc>
+          <w:tcPr/>
+          <w:p>
+            <w:pPr>
+              <w:pStyle w:val="Compact"/>
+            </w:pPr>
+            <w:r>
+              <w:rPr>
+                <w:b/>
+                <w:bCs/>
+              </w:rPr>
+              <w:t xml:space="preserve">Q-11</w:t>
+            </w:r>
+          </w:p>
+        </w:tc>
+        <w:tc>
+          <w:tcPr/>
+          <w:p>
+            <w:pPr>
+              <w:pStyle w:val="Compact"/>
+            </w:pPr>
+            <w:r>
+              <w:rPr>
+                <w:b/>
+                <w:bCs/>
+              </w:rPr>
+              <w:t xml:space="preserve">Galpão logístico com ESFR:</w:t>
+            </w:r>
+            <w:r>
+              <w:t xml:space="preserve"> </w:t>
+            </w:r>
+            <w:r>
+              <w:t xml:space="preserve">quando</w:t>
+            </w:r>
+            <w:r>
+              <w:t xml:space="preserve"> </w:t>
+            </w:r>
+            <w:r>
+              <w:rPr>
+                <w:b/>
+                <w:bCs/>
+              </w:rPr>
+              <w:t xml:space="preserve">reduzir a carga de incêndio ou restringir a operação do setor</w:t>
+            </w:r>
+            <w:r>
+              <w:t xml:space="preserve"> </w:t>
+            </w:r>
+            <w:r>
+              <w:t xml:space="preserve">com proteção indisponível; papel do locatário e do contrato</w:t>
+            </w:r>
+          </w:p>
+        </w:tc>
+        <w:tc>
+          <w:tcPr/>
+          <w:p>
+            <w:pPr>
+              <w:pStyle w:val="Compact"/>
+            </w:pPr>
+            <w:r>
+              <w:t xml:space="preserve">Decisão que só o síndico (com o RT) pode tomar</w:t>
+            </w:r>
+          </w:p>
+        </w:tc>
+        <w:tc>
+          <w:tcPr/>
+          <w:p>
+            <w:pPr>
+              <w:pStyle w:val="Compact"/>
+            </w:pPr>
+          </w:p>
+        </w:tc>
+      </w:tr>
+      <w:tr>
+        <w:tc>
+          <w:tcPr/>
+          <w:p>
+            <w:pPr>
+              <w:pStyle w:val="Compact"/>
+            </w:pPr>
+            <w:r>
+              <w:rPr>
+                <w:b/>
+                <w:bCs/>
+              </w:rPr>
+              <w:t xml:space="preserve">Q-12</w:t>
+            </w:r>
+          </w:p>
+        </w:tc>
+        <w:tc>
+          <w:tcPr/>
+          <w:p>
+            <w:pPr>
+              <w:pStyle w:val="Compact"/>
+            </w:pPr>
+            <w:r>
+              <w:rPr>
+                <w:b/>
+                <w:bCs/>
+              </w:rPr>
+              <w:t xml:space="preserve">Abono e indenização a locatários afetados</w:t>
+            </w:r>
+            <w:r>
+              <w:t xml:space="preserve"> </w:t>
+            </w:r>
+            <w:r>
+              <w:t xml:space="preserve">(alagamento, esgoto, água suspensa) e</w:t>
+            </w:r>
+            <w:r>
+              <w:t xml:space="preserve"> </w:t>
+            </w:r>
+            <w:r>
+              <w:rPr>
+                <w:b/>
+                <w:bCs/>
+              </w:rPr>
+              <w:t xml:space="preserve">responsabilidade pela caixa de gordura do locatário</w:t>
+            </w:r>
+            <w:r>
+              <w:t xml:space="preserve"> </w:t>
+            </w:r>
+            <w:r>
+              <w:t xml:space="preserve">(contrato)</w:t>
+            </w:r>
+          </w:p>
+        </w:tc>
+        <w:tc>
+          <w:tcPr/>
+          <w:p>
+            <w:pPr>
+              <w:pStyle w:val="Compact"/>
+            </w:pPr>
+            <w:r>
+              <w:t xml:space="preserve">Os Cenários 4 e 7 deixam em aberto</w:t>
+            </w:r>
+          </w:p>
+        </w:tc>
+        <w:tc>
+          <w:tcPr/>
+          <w:p>
+            <w:pPr>
+              <w:pStyle w:val="Compact"/>
+            </w:pPr>
+          </w:p>
+        </w:tc>
+      </w:tr>
+      <w:tr>
+        <w:tc>
+          <w:tcPr/>
+          <w:p>
+            <w:pPr>
+              <w:pStyle w:val="Compact"/>
+            </w:pPr>
+            <w:r>
+              <w:rPr>
+                <w:b/>
+                <w:bCs/>
+              </w:rPr>
+              <w:t xml:space="preserve">Q-13</w:t>
+            </w:r>
+          </w:p>
+        </w:tc>
+        <w:tc>
+          <w:tcPr/>
+          <w:p>
+            <w:pPr>
+              <w:pStyle w:val="Compact"/>
+            </w:pPr>
+            <w:r>
+              <w:rPr>
+                <w:b/>
+                <w:bCs/>
+              </w:rPr>
+              <w:t xml:space="preserve">Seguro:</w:t>
+            </w:r>
+            <w:r>
+              <w:t xml:space="preserve"> </w:t>
+            </w:r>
+            <w:r>
+              <w:t xml:space="preserve">prazo e procedimento de comunicação conforme a</w:t>
+            </w:r>
+            <w:r>
+              <w:t xml:space="preserve"> </w:t>
+            </w:r>
+            <w:r>
+              <w:rPr>
+                <w:b/>
+                <w:bCs/>
+              </w:rPr>
+              <w:t xml:space="preserve">apólice</w:t>
+            </w:r>
+            <w:r>
+              <w:t xml:space="preserve"> </w:t>
+            </w:r>
+            <w:r>
+              <w:t xml:space="preserve">de cada condomínio; o que fotografar e guardar</w:t>
+            </w:r>
+          </w:p>
+        </w:tc>
+        <w:tc>
+          <w:tcPr/>
+          <w:p>
+            <w:pPr>
+              <w:pStyle w:val="Compact"/>
+            </w:pPr>
+            <w:r>
+              <w:t xml:space="preserve">Os procedimentos mandam ler a apólice e não citam prazo</w:t>
+            </w:r>
+          </w:p>
+        </w:tc>
+        <w:tc>
+          <w:tcPr/>
+          <w:p>
+            <w:pPr>
+              <w:pStyle w:val="Compact"/>
+            </w:pPr>
+          </w:p>
+        </w:tc>
+      </w:tr>
+      <w:tr>
+        <w:tc>
+          <w:tcPr/>
+          <w:p>
+            <w:pPr>
+              <w:pStyle w:val="Compact"/>
+            </w:pPr>
+            <w:r>
+              <w:rPr>
+                <w:b/>
+                <w:bCs/>
+              </w:rPr>
+              <w:t xml:space="preserve">Q-14</w:t>
+            </w:r>
+          </w:p>
+        </w:tc>
+        <w:tc>
+          <w:tcPr/>
+          <w:p>
+            <w:pPr>
+              <w:pStyle w:val="Compact"/>
+            </w:pPr>
+            <w:r>
+              <w:rPr>
+                <w:b/>
+                <w:bCs/>
+              </w:rPr>
+              <w:t xml:space="preserve">Vazamento antes do hidrômetro ou do cavalete:</w:t>
+            </w:r>
+            <w:r>
+              <w:t xml:space="preserve"> </w:t>
+            </w:r>
+            <w:r>
+              <w:t xml:space="preserve">responsabilidade da concessionária e contato de emergência na ficha</w:t>
+            </w:r>
+          </w:p>
+        </w:tc>
+        <w:tc>
+          <w:tcPr/>
+          <w:p>
+            <w:pPr>
+              <w:pStyle w:val="Compact"/>
+            </w:pPr>
+            <w:r>
+              <w:t xml:space="preserve">Cen. 4</w:t>
+            </w:r>
+          </w:p>
+        </w:tc>
+        <w:tc>
+          <w:tcPr/>
+          <w:p>
+            <w:pPr>
+              <w:pStyle w:val="Compact"/>
+            </w:pPr>
+          </w:p>
+        </w:tc>
+      </w:tr>
     </w:tbl>
     <w:p>
       <w:r>
@@ -5262,55 +6610,7 @@
           <w:b/>
           <w:bCs/>
         </w:rPr>
-        <w:t xml:space="preserve">Cenários que ainda não existem, mas são citados:</w:t>
-      </w:r>
-      <w:r>
-        <w:t xml:space="preserve"> </w:t>
-      </w:r>
-      <w:r>
-        <w:rPr>
-          <w:b/>
-          <w:bCs/>
-        </w:rPr>
-        <w:t xml:space="preserve">4</w:t>
-      </w:r>
-      <w:r>
-        <w:t xml:space="preserve"> </w:t>
-      </w:r>
-      <w:r>
-        <w:t xml:space="preserve">(vazamento e alagamento),</w:t>
-      </w:r>
-      <w:r>
-        <w:t xml:space="preserve"> </w:t>
-      </w:r>
-      <w:r>
-        <w:rPr>
-          <w:b/>
-          <w:bCs/>
-        </w:rPr>
-        <w:t xml:space="preserve">6</w:t>
-      </w:r>
-      <w:r>
-        <w:t xml:space="preserve"> </w:t>
-      </w:r>
-      <w:r>
-        <w:t xml:space="preserve">(incêndio com reserva indisponível),</w:t>
-      </w:r>
-      <w:r>
-        <w:t xml:space="preserve"> </w:t>
-      </w:r>
-      <w:r>
-        <w:rPr>
-          <w:b/>
-          <w:bCs/>
-        </w:rPr>
-        <w:t xml:space="preserve">7</w:t>
-      </w:r>
-      <w:r>
-        <w:t xml:space="preserve"> </w:t>
-      </w:r>
-      <w:r>
-        <w:t xml:space="preserve">(refluxo de esgoto) e</w:t>
+        <w:t xml:space="preserve">Cenário que ainda não existe, mas é citado:</w:t>
       </w:r>
       <w:r>
         <w:t xml:space="preserve"> </w:t>
@@ -5326,7 +6626,23 @@
         <w:t xml:space="preserve"> </w:t>
       </w:r>
       <w:r>
-        <w:t xml:space="preserve">(comunicação de crise). Os procedimentos remetem a eles por número.</w:t>
+        <w:t xml:space="preserve">(comunicação de crise). Os procedimentos já remetem a ele; os cenários 4, 6 e 7 foram escritos depois dos outros e</w:t>
+      </w:r>
+      <w:r>
+        <w:t xml:space="preserve"> </w:t>
+      </w:r>
+      <w:r>
+        <w:rPr>
+          <w:b/>
+          <w:bCs/>
+        </w:rPr>
+        <w:t xml:space="preserve">ainda não foram conferidos contra os cenários 1 a 3, 5, 8 e 9</w:t>
+      </w:r>
+      <w:r>
+        <w:t xml:space="preserve"> </w:t>
+      </w:r>
+      <w:r>
+        <w:t xml:space="preserve">quanto a divergências de linguagem ou de limites.</w:t>
       </w:r>
     </w:p>
     <w:p>
@@ -5348,7 +6664,23 @@
         <w:t xml:space="preserve"> </w:t>
       </w:r>
       <w:r>
-        <w:t xml:space="preserve">é diferente entre cenários (ver V-07).</w:t>
+        <w:t xml:space="preserve">é diferente entre cenários (ver V-07). O Cenário 7 também sugere 30 dias.</w:t>
+      </w:r>
+      <w:r>
+        <w:t xml:space="preserve"> </w:t>
+      </w:r>
+      <w:r>
+        <w:rPr>
+          <w:b/>
+          <w:bCs/>
+        </w:rPr>
+        <w:t xml:space="preserve">Disque-Intoxicação:</w:t>
+      </w:r>
+      <w:r>
+        <w:t xml:space="preserve"> </w:t>
+      </w:r>
+      <w:r>
+        <w:t xml:space="preserve">o número aparece só no Cenário 1; nos demais ficou "a confirmar na ficha" (V-15). Convém o Cenário 1 ficar igual aos outros.</w:t>
       </w:r>
     </w:p>
     <w:p>

</xml_diff>